<commit_message>
fix(security): enforce strict password lock, remove local auto-unlock and guest bypass, and sync photo evidence review
</commit_message>
<xml_diff>
--- a/แบบข้อตกลงในการพัฒนางาน ไม่มีวิทยฐานะอนันตชัยปี69.docx
+++ b/แบบข้อตกลงในการพัฒนางาน ไม่มีวิทยฐานะอนันตชัยปี69.docx
@@ -2822,17 +2822,7 @@
           <w:szCs w:val="32"/>
           <w:cs/>
         </w:rPr>
-        <w:t xml:space="preserve"> </w:t>
-      </w:r>
-      <w:proofErr w:type="gramStart"/>
-      <w:r>
-        <w:rPr>
-          <w:rFonts w:ascii="TH SarabunPSK" w:hAnsi="TH SarabunPSK" w:cs="TH SarabunPSK"/>
-          <w:sz w:val="32"/>
-          <w:szCs w:val="32"/>
-          <w:cs/>
-        </w:rPr>
-        <w:t xml:space="preserve">กิจกรรมพัฒนาผู้เรียน  </w:t>
+        <w:t xml:space="preserve"> กิจกรรมพัฒนาผู้เรียน  </w:t>
       </w:r>
       <w:r>
         <w:rPr>
@@ -2843,7 +2833,6 @@
         </w:rPr>
         <w:tab/>
       </w:r>
-      <w:proofErr w:type="gramEnd"/>
       <w:r>
         <w:rPr>
           <w:rFonts w:ascii="TH SarabunPSK" w:hAnsi="TH SarabunPSK" w:cs="TH SarabunPSK"/>
@@ -2950,17 +2939,7 @@
           <w:szCs w:val="32"/>
           <w:cs/>
         </w:rPr>
-        <w:t xml:space="preserve"> </w:t>
-      </w:r>
-      <w:proofErr w:type="gramStart"/>
-      <w:r>
-        <w:rPr>
-          <w:rFonts w:ascii="TH SarabunPSK" w:hAnsi="TH SarabunPSK" w:cs="TH SarabunPSK"/>
-          <w:sz w:val="32"/>
-          <w:szCs w:val="32"/>
-          <w:cs/>
-        </w:rPr>
-        <w:t xml:space="preserve">กิจกรรมพัฒนาผู้เรียน  </w:t>
+        <w:t xml:space="preserve"> กิจกรรมพัฒนาผู้เรียน  </w:t>
       </w:r>
       <w:r>
         <w:rPr>
@@ -2971,7 +2950,6 @@
         </w:rPr>
         <w:tab/>
       </w:r>
-      <w:proofErr w:type="gramEnd"/>
       <w:r>
         <w:rPr>
           <w:rFonts w:ascii="TH SarabunPSK" w:hAnsi="TH SarabunPSK" w:cs="TH SarabunPSK"/>
@@ -3096,36 +3074,16 @@
           <w:szCs w:val="32"/>
           <w:cs/>
         </w:rPr>
-        <w:t xml:space="preserve"> </w:t>
-      </w:r>
-      <w:proofErr w:type="gramStart"/>
-      <w:r>
-        <w:rPr>
-          <w:rFonts w:ascii="TH SarabunPSK" w:hAnsi="TH SarabunPSK" w:cs="TH SarabunPSK"/>
-          <w:sz w:val="32"/>
-          <w:szCs w:val="32"/>
-          <w:cs/>
-        </w:rPr>
-        <w:t xml:space="preserve">กิจกรรมพัฒนาผู้เรียน  </w:t>
-      </w:r>
-      <w:r>
-        <w:rPr>
-          <w:rFonts w:ascii="TH SarabunPSK" w:hAnsi="TH SarabunPSK" w:cs="TH SarabunPSK"/>
-          <w:sz w:val="32"/>
-          <w:szCs w:val="32"/>
-          <w:cs/>
-        </w:rPr>
-        <w:t>จำนวน</w:t>
-      </w:r>
-      <w:proofErr w:type="gramEnd"/>
-      <w:r>
-        <w:rPr>
-          <w:rFonts w:ascii="TH SarabunPSK" w:hAnsi="TH SarabunPSK" w:cs="TH SarabunPSK"/>
-          <w:sz w:val="32"/>
-          <w:szCs w:val="32"/>
-          <w:cs/>
-        </w:rPr>
-        <w:t xml:space="preserve"> </w:t>
+        <w:t xml:space="preserve"> กิจกรรมพัฒนาผู้เรียน  </w:t>
+      </w:r>
+      <w:r>
+        <w:rPr>
+          <w:rFonts w:ascii="TH SarabunPSK" w:hAnsi="TH SarabunPSK" w:cs="TH SarabunPSK"/>
+          <w:sz w:val="32"/>
+          <w:szCs w:val="32"/>
+          <w:cs/>
+        </w:rPr>
+        <w:t xml:space="preserve">จำนวน </w:t>
       </w:r>
       <w:r>
         <w:rPr>
@@ -3192,36 +3150,16 @@
           <w:szCs w:val="32"/>
           <w:cs/>
         </w:rPr>
-        <w:t xml:space="preserve">ดการเรียนรู้ </w:t>
-      </w:r>
-      <w:proofErr w:type="gramStart"/>
-      <w:r>
-        <w:rPr>
-          <w:rFonts w:ascii="TH SarabunPSK" w:hAnsi="TH SarabunPSK" w:cs="TH SarabunPSK"/>
-          <w:sz w:val="32"/>
-          <w:szCs w:val="32"/>
-          <w:cs/>
-        </w:rPr>
-        <w:t xml:space="preserve">จำนวน </w:t>
-      </w:r>
-      <w:r>
-        <w:rPr>
-          <w:rFonts w:ascii="TH SarabunPSK" w:hAnsi="TH SarabunPSK" w:cs="TH SarabunPSK"/>
-          <w:sz w:val="32"/>
-          <w:szCs w:val="32"/>
-          <w:cs/>
-        </w:rPr>
-        <w:t xml:space="preserve"> ชั่วโมง</w:t>
-      </w:r>
-      <w:proofErr w:type="gramEnd"/>
-      <w:r>
-        <w:rPr>
-          <w:rFonts w:ascii="TH SarabunPSK" w:hAnsi="TH SarabunPSK" w:cs="TH SarabunPSK"/>
-          <w:sz w:val="32"/>
-          <w:szCs w:val="32"/>
-          <w:cs/>
-        </w:rPr>
-        <w:t>/สัปดาห์</w:t>
+        <w:t xml:space="preserve">ดการเรียนรู้ จำนวน </w:t>
+      </w:r>
+      <w:r>
+        <w:rPr>
+          <w:rFonts w:ascii="TH SarabunPSK" w:hAnsi="TH SarabunPSK" w:cs="TH SarabunPSK"/>
+          <w:sz w:val="32"/>
+          <w:szCs w:val="32"/>
+          <w:cs/>
+        </w:rPr>
+        <w:t xml:space="preserve"> ชั่วโมง/สัปดาห์</w:t>
       </w:r>
     </w:p>
     <w:p>
@@ -3250,36 +3188,26 @@
           <w:szCs w:val="32"/>
           <w:cs/>
         </w:rPr>
+        <w:t xml:space="preserve"> งานพัฒนาคุณภาพการจัดการศึกษา</w:t>
+      </w:r>
+      <w:r>
+        <w:rPr>
+          <w:rFonts w:ascii="TH SarabunPSK" w:hAnsi="TH SarabunPSK" w:cs="TH SarabunPSK"/>
+          <w:sz w:val="32"/>
+          <w:szCs w:val="32"/>
+          <w:cs/>
+        </w:rPr>
+        <w:t xml:space="preserve">ของสถานศึกษา </w:t>
+      </w:r>
+      <w:r>
+        <w:rPr>
+          <w:rFonts w:ascii="TH SarabunPSK" w:hAnsi="TH SarabunPSK" w:cs="TH SarabunPSK"/>
+          <w:sz w:val="32"/>
+          <w:szCs w:val="32"/>
+          <w:cs/>
+        </w:rPr>
         <w:t xml:space="preserve"> </w:t>
       </w:r>
-      <w:proofErr w:type="gramStart"/>
-      <w:r>
-        <w:rPr>
-          <w:rFonts w:ascii="TH SarabunPSK" w:hAnsi="TH SarabunPSK" w:cs="TH SarabunPSK"/>
-          <w:sz w:val="32"/>
-          <w:szCs w:val="32"/>
-          <w:cs/>
-        </w:rPr>
-        <w:t>งานพัฒนาคุณภาพการจัดการศึกษา</w:t>
-      </w:r>
-      <w:r>
-        <w:rPr>
-          <w:rFonts w:ascii="TH SarabunPSK" w:hAnsi="TH SarabunPSK" w:cs="TH SarabunPSK"/>
-          <w:sz w:val="32"/>
-          <w:szCs w:val="32"/>
-          <w:cs/>
-        </w:rPr>
-        <w:t xml:space="preserve">ของสถานศึกษา </w:t>
-      </w:r>
-      <w:r>
-        <w:rPr>
-          <w:rFonts w:ascii="TH SarabunPSK" w:hAnsi="TH SarabunPSK" w:cs="TH SarabunPSK"/>
-          <w:sz w:val="32"/>
-          <w:szCs w:val="32"/>
-          <w:cs/>
-        </w:rPr>
-        <w:t xml:space="preserve"> </w:t>
-      </w:r>
       <w:r>
         <w:rPr>
           <w:rFonts w:ascii="TH SarabunPSK" w:hAnsi="TH SarabunPSK" w:cs="TH SarabunPSK"/>
@@ -3289,7 +3217,6 @@
         </w:rPr>
         <w:t>จำนวน</w:t>
       </w:r>
-      <w:proofErr w:type="gramEnd"/>
       <w:r>
         <w:rPr>
           <w:rFonts w:ascii="TH SarabunPSK" w:hAnsi="TH SarabunPSK" w:cs="TH SarabunPSK"/>
@@ -3387,7 +3314,6 @@
         </w:rPr>
         <w:t xml:space="preserve">2. </w:t>
       </w:r>
-      <w:proofErr w:type="gramStart"/>
       <w:r>
         <w:rPr>
           <w:rFonts w:ascii="TH SarabunPSK" w:hAnsi="TH SarabunPSK" w:cs="TH SarabunPSK"/>
@@ -3397,19 +3323,7 @@
           <w:szCs w:val="32"/>
           <w:cs/>
         </w:rPr>
-        <w:t>งานที่จะปฏิบัติตามมาตรฐานตำแหน่งครู  (</w:t>
-      </w:r>
-      <w:proofErr w:type="gramEnd"/>
-      <w:r>
-        <w:rPr>
-          <w:rFonts w:ascii="TH SarabunPSK" w:hAnsi="TH SarabunPSK" w:cs="TH SarabunPSK"/>
-          <w:b/>
-          <w:bCs/>
-          <w:sz w:val="32"/>
-          <w:szCs w:val="32"/>
-          <w:cs/>
-        </w:rPr>
-        <w:t>ให้ระบุรายละเอียดของงานที่จะปฏิบัติในแต่ละด้านว่าจะดำเนินการอย่างไร โดยอาจระบุระยะเวลาที่ใช้ในการดำเนินการด้วยก็ได้)</w:t>
+        <w:t>งานที่จะปฏิบัติตามมาตรฐานตำแหน่งครู  (ให้ระบุรายละเอียดของงานที่จะปฏิบัติในแต่ละด้านว่าจะดำเนินการอย่างไร โดยอาจระบุระยะเวลาที่ใช้ในการดำเนินการด้วยก็ได้)</w:t>
       </w:r>
     </w:p>
     <w:p>
@@ -5147,7 +5061,6 @@
                 <w:cs/>
               </w:rPr>
             </w:pPr>
-            <w:proofErr w:type="gramStart"/>
             <w:r>
               <w:rPr>
                 <w:rFonts w:ascii="TH SarabunPSK" w:hAnsi="TH SarabunPSK" w:cs="TH SarabunPSK"/>
@@ -5155,37 +5068,7 @@
                 <w:sz w:val="32"/>
                 <w:szCs w:val="32"/>
               </w:rPr>
-              <w:t>On Line</w:t>
-            </w:r>
-            <w:proofErr w:type="gramEnd"/>
-            <w:r>
-              <w:rPr>
-                <w:rFonts w:ascii="TH SarabunPSK" w:hAnsi="TH SarabunPSK" w:cs="TH SarabunPSK"/>
-                <w:color w:val="000000" w:themeColor="text1"/>
-                <w:sz w:val="32"/>
-                <w:szCs w:val="32"/>
-              </w:rPr>
-              <w:t xml:space="preserve"> On Hand </w:t>
-            </w:r>
-            <w:proofErr w:type="gramStart"/>
-            <w:r>
-              <w:rPr>
-                <w:rFonts w:ascii="TH SarabunPSK" w:hAnsi="TH SarabunPSK" w:cs="TH SarabunPSK"/>
-                <w:color w:val="000000" w:themeColor="text1"/>
-                <w:sz w:val="32"/>
-                <w:szCs w:val="32"/>
-              </w:rPr>
-              <w:t>On</w:t>
-            </w:r>
-            <w:proofErr w:type="gramEnd"/>
-            <w:r>
-              <w:rPr>
-                <w:rFonts w:ascii="TH SarabunPSK" w:hAnsi="TH SarabunPSK" w:cs="TH SarabunPSK"/>
-                <w:color w:val="000000" w:themeColor="text1"/>
-                <w:sz w:val="32"/>
-                <w:szCs w:val="32"/>
-              </w:rPr>
-              <w:t xml:space="preserve"> Demand </w:t>
+              <w:t xml:space="preserve">On Line On Hand On Demand </w:t>
             </w:r>
             <w:r>
               <w:rPr>
@@ -6868,12 +6751,20 @@
             <w:pPr>
               <w:rPr>
                 <w:rFonts w:ascii="TH SarabunPSK" w:hAnsi="TH SarabunPSK" w:cs="TH SarabunPSK"/>
+                <w:sz w:val="32"/>
+                <w:szCs w:val="32"/>
+              </w:rPr>
+            </w:pPr>
+            <w:r>
+              <w:rPr>
+                <w:rFonts w:ascii="TH SarabunPSK" w:hAnsi="TH SarabunPSK" w:cs="TH SarabunPSK"/>
                 <w:color w:val="000000" w:themeColor="text1"/>
                 <w:sz w:val="32"/>
                 <w:szCs w:val="32"/>
                 <w:cs/>
               </w:rPr>
-            </w:pPr>
+              <w:t>1. ร้อยละ 85 ของผู้เรียนมีผลการประเมินในด้านสมรรถนะสำคัญตามหลักสูตรสูงขึ้นเป็นไปตามค่าเป้าหมายที่สถานศึกษากำหนด</w:t>
+            </w:r>
             <w:r>
               <w:rPr>
                 <w:rFonts w:ascii="TH SarabunPSK" w:hAnsi="TH SarabunPSK" w:cs="TH SarabunPSK"/>
@@ -6882,8 +6773,39 @@
                 <w:szCs w:val="32"/>
                 <w:cs/>
               </w:rPr>
-              <w:t>1. ร้อยละ 85 ของผู้เรียนมีผลการประเมินในด้านสมรรถนะสำคัญตามหลักสูตรสูงขึ้นเป็นไปตามค่าเป้าหมายที่สถานศึกษากำหนด</w:t>
-            </w:r>
+              <w:br/>
+            </w:r>
+            <w:r>
+              <w:rPr>
+                <w:rFonts w:ascii="TH SarabunPSK" w:hAnsi="TH SarabunPSK" w:cs="TH SarabunPSK" w:hint="cs"/>
+                <w:color w:val="EE0000"/>
+                <w:sz w:val="32"/>
+                <w:szCs w:val="32"/>
+                <w:cs/>
+              </w:rPr>
+              <w:t>ได้มี</w:t>
+            </w:r>
+            <w:r>
+              <w:rPr>
+                <w:rFonts w:ascii="TH SarabunPSK" w:hAnsi="TH SarabunPSK" w:cs="TH SarabunPSK"/>
+                <w:color w:val="EE0000"/>
+                <w:sz w:val="32"/>
+                <w:szCs w:val="32"/>
+                <w:cs/>
+              </w:rPr>
+              <w:t>การจัดบรรยากาศที่ส่งเสริมและพัฒนาผู้เรียน ให้เกิดกระบวนการคิด ทักษะชีวิต ทักษะการทำงาน ทักษะการเรียนรู้และนวัตกรรม ทักษะด้านสารสนเทศ สื่อ และเทคโนโลยี</w:t>
+            </w:r>
+          </w:p>
+          <w:p>
+            <w:pPr>
+              <w:rPr>
+                <w:rFonts w:ascii="TH SarabunPSK" w:hAnsi="TH SarabunPSK" w:cs="TH SarabunPSK"/>
+                <w:color w:val="000000" w:themeColor="text1"/>
+                <w:sz w:val="32"/>
+                <w:szCs w:val="32"/>
+                <w:cs/>
+              </w:rPr>
+            </w:pPr>
           </w:p>
         </w:tc>
       </w:tr>
@@ -7174,7 +7096,6 @@
                 <w:szCs w:val="32"/>
                 <w:cs/>
               </w:rPr>
-              <w:lastRenderedPageBreak/>
               <w:t>ลักษณะงานที่ปฏิบัติ</w:t>
             </w:r>
           </w:p>
@@ -7670,28 +7591,51 @@
             <w:pPr>
               <w:rPr>
                 <w:rFonts w:ascii="TH SarabunPSK" w:hAnsi="TH SarabunPSK" w:cs="TH SarabunPSK"/>
-                <w:sz w:val="32"/>
-                <w:szCs w:val="32"/>
-                <w:cs/>
-              </w:rPr>
-            </w:pPr>
-            <w:r>
-              <w:rPr>
-                <w:rFonts w:ascii="TH SarabunPSK" w:hAnsi="TH SarabunPSK" w:cs="TH SarabunPSK"/>
-                <w:sz w:val="32"/>
-                <w:szCs w:val="32"/>
-                <w:cs/>
-              </w:rPr>
-              <w:t>1. ผู้เรียนใช้ข้อมูลสารสนเทศตรวจสอบ</w:t>
-            </w:r>
-            <w:r>
-              <w:rPr>
-                <w:rFonts w:ascii="TH SarabunPSK" w:hAnsi="TH SarabunPSK" w:cs="TH SarabunPSK"/>
-                <w:sz w:val="32"/>
-                <w:szCs w:val="32"/>
-                <w:cs/>
-              </w:rPr>
-              <w:t>คะแนนส่วนบุคคลได้</w:t>
+                <w:color w:val="EE0000"/>
+                <w:sz w:val="32"/>
+                <w:szCs w:val="32"/>
+              </w:rPr>
+            </w:pPr>
+            <w:r>
+              <w:rPr>
+                <w:rFonts w:ascii="TH SarabunPSK" w:hAnsi="TH SarabunPSK" w:cs="TH SarabunPSK"/>
+                <w:color w:val="EE0000"/>
+                <w:sz w:val="32"/>
+                <w:szCs w:val="32"/>
+                <w:cs/>
+              </w:rPr>
+              <w:t>จัดทำข้อมูลสารสนเทศของผู้เรียนและรายวิชา เพื่อใช้ในการส่งเสริมสนับสนุนการเรียนรู้ พัฒนาคุณภาพผู้เรียน</w:t>
+            </w:r>
+          </w:p>
+          <w:p>
+            <w:pPr>
+              <w:rPr>
+                <w:rFonts w:ascii="TH SarabunPSK" w:hAnsi="TH SarabunPSK" w:cs="TH SarabunPSK"/>
+                <w:color w:val="EE0000"/>
+                <w:sz w:val="32"/>
+                <w:szCs w:val="32"/>
+                <w:cs/>
+              </w:rPr>
+            </w:pPr>
+            <w:r>
+              <w:rPr>
+                <w:rFonts w:ascii="TH SarabunPSK" w:hAnsi="TH SarabunPSK" w:cs="TH SarabunPSK" w:hint="cs"/>
+                <w:color w:val="EE0000"/>
+                <w:sz w:val="32"/>
+                <w:szCs w:val="32"/>
+                <w:cs/>
+              </w:rPr>
+              <w:t xml:space="preserve">และ </w:t>
+            </w:r>
+            <w:r>
+              <w:rPr>
+                <w:rFonts w:ascii="TH SarabunPSK" w:hAnsi="TH SarabunPSK" w:cs="TH SarabunPSK"/>
+                <w:color w:val="EE0000"/>
+                <w:sz w:val="32"/>
+                <w:szCs w:val="32"/>
+                <w:cs/>
+              </w:rPr>
+              <w:t>จัดทำรายงานข้อมูลสารสนเทศผู้เรียนรายบุคคลและข้อมูลรายวิชาที่สอนผ่านระบบออนไลน์</w:t>
             </w:r>
           </w:p>
         </w:tc>
@@ -7703,19 +7647,61 @@
             <w:pPr>
               <w:rPr>
                 <w:rFonts w:ascii="TH SarabunPSK" w:hAnsi="TH SarabunPSK" w:cs="TH SarabunPSK"/>
-                <w:sz w:val="32"/>
-                <w:szCs w:val="32"/>
-                <w:cs/>
-              </w:rPr>
-            </w:pPr>
-            <w:r>
-              <w:rPr>
-                <w:rFonts w:ascii="TH SarabunPSK" w:hAnsi="TH SarabunPSK" w:cs="TH SarabunPSK"/>
-                <w:sz w:val="32"/>
-                <w:szCs w:val="32"/>
-                <w:cs/>
-              </w:rPr>
-              <w:t>1. ผู้เรียนร้อยละ 100 ได้ใช้ประโยชน์จากสารสนเทศ</w:t>
+                <w:color w:val="EE0000"/>
+                <w:sz w:val="32"/>
+                <w:szCs w:val="32"/>
+              </w:rPr>
+            </w:pPr>
+            <w:r>
+              <w:rPr>
+                <w:rFonts w:ascii="TH SarabunPSK" w:hAnsi="TH SarabunPSK" w:cs="TH SarabunPSK" w:hint="cs"/>
+                <w:color w:val="EE0000"/>
+                <w:sz w:val="32"/>
+                <w:szCs w:val="32"/>
+                <w:cs/>
+              </w:rPr>
+              <w:t>ได้</w:t>
+            </w:r>
+            <w:r>
+              <w:rPr>
+                <w:rFonts w:ascii="TH SarabunPSK" w:hAnsi="TH SarabunPSK" w:cs="TH SarabunPSK"/>
+                <w:color w:val="EE0000"/>
+                <w:sz w:val="32"/>
+                <w:szCs w:val="32"/>
+                <w:cs/>
+              </w:rPr>
+              <w:t>จัดทำข้อมูลสารสนเทศของผู้เรียนและรายวิชา เพื่อใช้ในการส่งเสริมสนับสนุนการเรียนรู้ พัฒนาคุณภาพผู้เรียน</w:t>
+            </w:r>
+          </w:p>
+          <w:p>
+            <w:pPr>
+              <w:rPr>
+                <w:rFonts w:ascii="TH SarabunPSK" w:hAnsi="TH SarabunPSK" w:cs="TH SarabunPSK"/>
+                <w:color w:val="EE0000"/>
+                <w:sz w:val="32"/>
+                <w:szCs w:val="32"/>
+                <w:cs/>
+              </w:rPr>
+            </w:pPr>
+            <w:r>
+              <w:rPr>
+                <w:rFonts w:ascii="TH SarabunPSK" w:hAnsi="TH SarabunPSK" w:cs="TH SarabunPSK" w:hint="cs"/>
+                <w:color w:val="EE0000"/>
+                <w:sz w:val="32"/>
+                <w:szCs w:val="32"/>
+                <w:cs/>
+              </w:rPr>
+              <w:t xml:space="preserve">และ </w:t>
+            </w:r>
+            <w:r>
+              <w:rPr>
+                <w:rFonts w:ascii="TH SarabunPSK" w:hAnsi="TH SarabunPSK" w:cs="TH SarabunPSK"/>
+                <w:color w:val="EE0000"/>
+                <w:sz w:val="32"/>
+                <w:szCs w:val="32"/>
+                <w:cs/>
+              </w:rPr>
+              <w:t>จัดทำรายงานข้อมูลสารสนเทศผู้เรียนรายบุคคลและข้อมูลรายวิชาที่สอนผ่านระบบออนไลน์</w:t>
             </w:r>
           </w:p>
         </w:tc>
@@ -7851,7 +7837,17 @@
                 <w:szCs w:val="32"/>
                 <w:cs/>
               </w:rPr>
-              <w:t>1. นักเรียนได้รับการสนับสนุนช่วยเหลือดูแลทั้งด้านวิชาการ ลักษณะนิสัยอันพึงประสงค์ ร่วมทั้งสมรรถนะสำคัญผู้เรียน</w:t>
+              <w:t>1. นักเรียนได้รับการสนับสนุนช่วยเหลือดูแลทั้งด้านวิชาการ ลักษณะนิสัยอันพึงประสงค์ ร่วม</w:t>
+            </w:r>
+            <w:r>
+              <w:rPr>
+                <w:rFonts w:ascii="TH SarabunPSK" w:hAnsi="TH SarabunPSK" w:cs="TH SarabunPSK"/>
+                <w:sz w:val="32"/>
+                <w:szCs w:val="32"/>
+                <w:cs/>
+              </w:rPr>
+              <w:lastRenderedPageBreak/>
+              <w:t>ทั้งสมรรถนะสำคัญผู้เรียน</w:t>
             </w:r>
           </w:p>
           <w:p>
@@ -7894,6 +7890,7 @@
                 <w:szCs w:val="32"/>
                 <w:cs/>
               </w:rPr>
+              <w:lastRenderedPageBreak/>
               <w:t>2. ครูผู้ปกครองและผู้ที่เกี่ยวข้องร้อยละ 100 สามารถรับรู้ความก้าวหน้าพัฒนาการของผู้เรียนและสามารถช่วยเหลือนักเรียนได้อย่างทั่วถึง</w:t>
             </w:r>
           </w:p>
@@ -7950,7 +7947,6 @@
                 <w:szCs w:val="32"/>
                 <w:cs/>
               </w:rPr>
-              <w:lastRenderedPageBreak/>
               <w:t>ลักษณะงานที่ปฏิบัติ</w:t>
             </w:r>
           </w:p>
@@ -8335,7 +8331,17 @@
                 <w:szCs w:val="32"/>
                 <w:cs/>
               </w:rPr>
-              <w:t>การจัดการเรียนรู้ลักษณะงานที่เสนอให้ครอบคลุมถึงการจัดทำข้อมูลสารสนเทศของผู้เรียนและรายวิชาการดำเนินการตามระบบดูแลช่วยเหลือผู้เรียน การปฏิบัติงานวิชาการและงานอื่นๆ ของสถานศึกษา และการประสานความร่วมมือกับผู้ปกครอง ภาคีเครือข่าย และหรือสถานประกอบการ</w:t>
+              <w:t xml:space="preserve">การจัดการเรียนรู้ลักษณะงานที่เสนอให้ครอบคลุมถึงการจัดทำข้อมูลสารสนเทศของผู้เรียนและรายวิชาการดำเนินการตามระบบดูแลช่วยเหลือผู้เรียน การปฏิบัติงานวิชาการและงานอื่นๆ ของสถานศึกษา และการประสานความร่วมมือกับผู้ปกครอง ภาคีเครือข่าย </w:t>
+            </w:r>
+            <w:r>
+              <w:rPr>
+                <w:rFonts w:ascii="TH SarabunPSK" w:hAnsi="TH SarabunPSK" w:cs="TH SarabunPSK"/>
+                <w:sz w:val="32"/>
+                <w:szCs w:val="32"/>
+                <w:cs/>
+              </w:rPr>
+              <w:lastRenderedPageBreak/>
+              <w:t>และหรือสถานประกอบการ</w:t>
             </w:r>
           </w:p>
           <w:p>
@@ -8370,6 +8376,7 @@
                 <w:szCs w:val="32"/>
                 <w:cs/>
               </w:rPr>
+              <w:lastRenderedPageBreak/>
               <w:t>2.3 ปฏิบัติงานวิชาการ และงานอื่นๆ ของสถานศึกษา</w:t>
             </w:r>
           </w:p>
@@ -8852,7 +8859,6 @@
                 <w:szCs w:val="32"/>
                 <w:cs/>
               </w:rPr>
-              <w:lastRenderedPageBreak/>
               <w:t>ลักษณะงานที่ปฏิบัติ</w:t>
             </w:r>
           </w:p>
@@ -9236,7 +9242,17 @@
                 <w:szCs w:val="32"/>
                 <w:cs/>
               </w:rPr>
-              <w:t>เพื่อพัฒนาการจัดการเรียนรู้และการนำความรู้ความสามารถ ทักษะที่ได้จากการพัฒนาตนเองและวิชาชีพมาใช้ในการพัฒนาการจัดการเรียนรู้ การพัฒนาคุณภาพผู้เรียน และการพัฒนานวัตกรรมและการจัดการเรียนรู้</w:t>
+              <w:t xml:space="preserve">เพื่อพัฒนาการจัดการเรียนรู้และการนำความรู้ความสามารถ ทักษะที่ได้จากการพัฒนาตนเองและวิชาชีพมาใช้ในการพัฒนาการจัดการเรียนรู้ </w:t>
+            </w:r>
+            <w:r>
+              <w:rPr>
+                <w:rFonts w:ascii="TH SarabunPSK" w:hAnsi="TH SarabunPSK" w:cs="TH SarabunPSK"/>
+                <w:sz w:val="32"/>
+                <w:szCs w:val="32"/>
+                <w:cs/>
+              </w:rPr>
+              <w:lastRenderedPageBreak/>
+              <w:t>การพัฒนาคุณภาพผู้เรียน และการพัฒนานวัตกรรมและการจัดการเรียนรู้</w:t>
             </w:r>
           </w:p>
         </w:tc>
@@ -9261,6 +9277,7 @@
                 <w:szCs w:val="32"/>
                 <w:cs/>
               </w:rPr>
+              <w:lastRenderedPageBreak/>
               <w:t>3.1 พัฒนาตนเองอย่างเป็นระบบและต่อเนื่อง</w:t>
             </w:r>
             <w:r>
@@ -9745,7 +9762,6 @@
                 <w:szCs w:val="32"/>
                 <w:cs/>
               </w:rPr>
-              <w:lastRenderedPageBreak/>
               <w:t>ลักษณะงานที่ปฏิบัติ</w:t>
             </w:r>
           </w:p>
@@ -10119,7 +10135,17 @@
                 <w:szCs w:val="32"/>
                 <w:cs/>
               </w:rPr>
-              <w:t>ลักษณะงานที่เสนอให้ครอบคลุมถึงการพัฒนาตนเองอย่างเป็นระบบและต่อเนื่อง การมีส่วนร่วมในการแลกเปลี่ยนเรียนรู้ทางวิชาชีพเพื่อพัฒนาการจัดการเรียนรู้และการนำความรู้ความสามารถ ทักษะที่ได้จากการพัฒนาตนเองและวิชาชีพมาใช้ในการพัฒนาการจัดการเรียนรู้ การพัฒนาคุณภาพผู้เรียน และการพัฒนานวัตกรรมและการจัดการเรียนรู้</w:t>
+              <w:t>ลักษณะงานที่เสนอให้ครอบคลุมถึงการพัฒนาตนเองอย่างเป็นระบบและต่อเนื่อง การมีส่วนร่วมในการแลกเปลี่ยนเรียนรู้ทางวิชาชีพเพื่อพัฒนาการจัดการเรียนรู้และการนำความรู้ความสามารถ ทักษะที่ได้จากการพัฒนาตนเองและวิชาชีพมาใช้ในการพัฒนาการจัดการเรียนรู้ การพัฒนาคุณภาพ</w:t>
+            </w:r>
+            <w:r>
+              <w:rPr>
+                <w:rFonts w:ascii="TH SarabunPSK" w:hAnsi="TH SarabunPSK" w:cs="TH SarabunPSK"/>
+                <w:sz w:val="32"/>
+                <w:szCs w:val="32"/>
+                <w:cs/>
+              </w:rPr>
+              <w:lastRenderedPageBreak/>
+              <w:t>ผู้เรียน และการพัฒนานวัตกรรมและการจัดการเรียนรู้</w:t>
             </w:r>
           </w:p>
         </w:tc>
@@ -10146,6 +10172,7 @@
                 <w:szCs w:val="32"/>
                 <w:cs/>
               </w:rPr>
+              <w:lastRenderedPageBreak/>
               <w:t>3.3 นำความรู้ ความสามารถ ทักษะที่ได้จากการพัฒนาตนเองและวิชาชีพมาใช้ในการพัฒนาการจัดการเรียนรู้</w:t>
             </w:r>
           </w:p>
@@ -10174,23 +10201,13 @@
               </w:rPr>
               <w:t xml:space="preserve"> การเข้าร่วมการอบรม/การประชุมรูปแบบต่าง ๆ ทั้งแบบ </w:t>
             </w:r>
-            <w:proofErr w:type="gramStart"/>
-            <w:r>
-              <w:rPr>
-                <w:rFonts w:ascii="TH SarabunPSK" w:hAnsi="TH SarabunPSK" w:cs="TH SarabunPSK"/>
-                <w:sz w:val="32"/>
-                <w:szCs w:val="32"/>
-              </w:rPr>
-              <w:t>On Line</w:t>
-            </w:r>
-            <w:proofErr w:type="gramEnd"/>
-            <w:r>
-              <w:rPr>
-                <w:rFonts w:ascii="TH SarabunPSK" w:hAnsi="TH SarabunPSK" w:cs="TH SarabunPSK"/>
-                <w:sz w:val="32"/>
-                <w:szCs w:val="32"/>
-              </w:rPr>
-              <w:t xml:space="preserve"> </w:t>
+            <w:r>
+              <w:rPr>
+                <w:rFonts w:ascii="TH SarabunPSK" w:hAnsi="TH SarabunPSK" w:cs="TH SarabunPSK"/>
+                <w:sz w:val="32"/>
+                <w:szCs w:val="32"/>
+              </w:rPr>
+              <w:t xml:space="preserve">On Line </w:t>
             </w:r>
             <w:r>
               <w:rPr>
@@ -10338,6 +10355,108 @@
               </w:rPr>
               <w:t>ออนไลน์</w:t>
             </w:r>
+          </w:p>
+        </w:tc>
+      </w:tr>
+      <w:tr>
+        <w:trPr>
+          <w:trHeight w:val="3626"/>
+        </w:trPr>
+        <w:tc>
+          <w:tcPr>
+            <w:tcW w:w="2263" w:type="dxa"/>
+          </w:tcPr>
+          <w:p>
+            <w:pPr>
+              <w:rPr>
+                <w:rFonts w:ascii="TH SarabunPSK" w:hAnsi="TH SarabunPSK" w:cs="TH SarabunPSK"/>
+                <w:b/>
+                <w:bCs/>
+                <w:sz w:val="32"/>
+                <w:szCs w:val="32"/>
+                <w:cs/>
+              </w:rPr>
+            </w:pPr>
+            <w:r>
+              <w:rPr>
+                <w:rFonts w:ascii="TH SarabunPSK" w:hAnsi="TH SarabunPSK" w:cs="TH SarabunPSK" w:hint="cs"/>
+                <w:b/>
+                <w:bCs/>
+                <w:sz w:val="32"/>
+                <w:szCs w:val="32"/>
+                <w:cs/>
+              </w:rPr>
+              <w:t xml:space="preserve">ด้านที่ 4 </w:t>
+            </w:r>
+            <w:r>
+              <w:rPr>
+                <w:rFonts w:ascii="TH SarabunPSK" w:hAnsi="TH SarabunPSK" w:cs="TH SarabunPSK" w:hint="cs"/>
+                <w:b/>
+                <w:bCs/>
+                <w:sz w:val="32"/>
+                <w:szCs w:val="32"/>
+                <w:cs/>
+              </w:rPr>
+              <w:t>การพัฒนาคุณภาพมาตราโรงเรียน</w:t>
+            </w:r>
+          </w:p>
+        </w:tc>
+        <w:tc>
+          <w:tcPr>
+            <w:tcW w:w="3390" w:type="dxa"/>
+          </w:tcPr>
+          <w:p>
+            <w:pPr>
+              <w:rPr>
+                <w:rFonts w:ascii="TH SarabunPSK" w:hAnsi="TH SarabunPSK" w:cs="TH SarabunPSK" w:hint="cs"/>
+                <w:b/>
+                <w:bCs/>
+                <w:sz w:val="32"/>
+                <w:szCs w:val="32"/>
+              </w:rPr>
+            </w:pPr>
+            <w:r>
+              <w:rPr>
+                <w:rFonts w:ascii="TH SarabunPSK" w:hAnsi="TH SarabunPSK" w:cs="TH SarabunPSK" w:hint="cs"/>
+                <w:b/>
+                <w:bCs/>
+                <w:sz w:val="32"/>
+                <w:szCs w:val="32"/>
+                <w:cs/>
+              </w:rPr>
+              <w:t>4.1 ใช้สื่อ เทคโนโลยีสารสนเทศ และ แหล่งเรียนรู้ที้อื้อต่อการเรียนรู้</w:t>
+            </w:r>
+          </w:p>
+        </w:tc>
+        <w:tc>
+          <w:tcPr>
+            <w:tcW w:w="2299" w:type="dxa"/>
+          </w:tcPr>
+          <w:p>
+            <w:pPr>
+              <w:rPr>
+                <w:rFonts w:ascii="TH SarabunPSK" w:hAnsi="TH SarabunPSK" w:cs="TH SarabunPSK"/>
+                <w:sz w:val="32"/>
+                <w:szCs w:val="32"/>
+                <w:cs/>
+              </w:rPr>
+            </w:pPr>
+          </w:p>
+        </w:tc>
+        <w:tc>
+          <w:tcPr>
+            <w:tcW w:w="1950" w:type="dxa"/>
+          </w:tcPr>
+          <w:p>
+            <w:pPr>
+              <w:rPr>
+                <w:rFonts w:ascii="TH SarabunPSK" w:hAnsi="TH SarabunPSK" w:cs="TH SarabunPSK"/>
+                <w:color w:val="000000" w:themeColor="text1"/>
+                <w:sz w:val="32"/>
+                <w:szCs w:val="32"/>
+                <w:cs/>
+              </w:rPr>
+            </w:pPr>
           </w:p>
         </w:tc>
       </w:tr>
@@ -10589,7 +10708,6 @@
           <w:szCs w:val="32"/>
           <w:cs/>
         </w:rPr>
-        <w:lastRenderedPageBreak/>
         <w:t xml:space="preserve">ส่วนที่ </w:t>
       </w:r>
       <w:r>
@@ -10778,7 +10896,7 @@
           <w:rFonts w:ascii="TH SarabunPSK" w:hAnsi="TH SarabunPSK" w:cs="TH SarabunPSK"/>
           <w:b/>
           <w:bCs/>
-          <w:color w:val="000000" w:themeColor="text1"/>
+          <w:color w:val="EE0000"/>
           <w:sz w:val="32"/>
           <w:szCs w:val="32"/>
         </w:rPr>
@@ -10793,7 +10911,21 @@
           <w:szCs w:val="32"/>
           <w:cs/>
         </w:rPr>
+        <w:lastRenderedPageBreak/>
         <w:t>1. สภาพปัญหาของผู้เรียนและการจัดการเรียนรู้</w:t>
+      </w:r>
+      <w:r>
+        <w:rPr>
+          <w:rFonts w:ascii="TH SarabunPSK" w:hAnsi="TH SarabunPSK" w:cs="TH SarabunPSK" w:hint="cs"/>
+          <w:b/>
+          <w:bCs/>
+          <w:color w:val="EE0000"/>
+          <w:sz w:val="32"/>
+          <w:szCs w:val="32"/>
+          <w:u w:val="single"/>
+          <w:cs/>
+        </w:rPr>
+        <w:t>(ปัญหาต้องมาจาดหลังแผน)</w:t>
       </w:r>
     </w:p>
     <w:p>
@@ -11579,25 +11711,14 @@
         </w:rPr>
         <w:t>คน เกี่ยวกับทักษะการใช้เมาส์ โดยใช้แบบทดสอบก่อนเรียน (</w:t>
       </w:r>
-      <w:proofErr w:type="gramStart"/>
-      <w:r>
-        <w:rPr>
-          <w:rFonts w:ascii="TH SarabunPSK" w:hAnsi="TH SarabunPSK" w:cs="TH SarabunPSK"/>
-          <w:color w:val="000000" w:themeColor="text1"/>
-          <w:sz w:val="32"/>
-          <w:szCs w:val="32"/>
-        </w:rPr>
-        <w:t>Pre-test</w:t>
-      </w:r>
-      <w:proofErr w:type="gramEnd"/>
-      <w:r>
-        <w:rPr>
-          <w:rFonts w:ascii="TH SarabunPSK" w:hAnsi="TH SarabunPSK" w:cs="TH SarabunPSK"/>
-          <w:color w:val="000000" w:themeColor="text1"/>
-          <w:sz w:val="32"/>
-          <w:szCs w:val="32"/>
-        </w:rPr>
-        <w:t xml:space="preserve">) </w:t>
+      <w:r>
+        <w:rPr>
+          <w:rFonts w:ascii="TH SarabunPSK" w:hAnsi="TH SarabunPSK" w:cs="TH SarabunPSK"/>
+          <w:color w:val="000000" w:themeColor="text1"/>
+          <w:sz w:val="32"/>
+          <w:szCs w:val="32"/>
+        </w:rPr>
+        <w:t xml:space="preserve">Pre-test) </w:t>
       </w:r>
       <w:r>
         <w:rPr>
@@ -11756,7 +11877,6 @@
           <w:sz w:val="32"/>
           <w:szCs w:val="32"/>
         </w:rPr>
-        <w:lastRenderedPageBreak/>
         <w:t xml:space="preserve">• </w:t>
       </w:r>
       <w:r>
@@ -12151,6 +12271,7 @@
           <w:sz w:val="32"/>
           <w:szCs w:val="32"/>
         </w:rPr>
+        <w:lastRenderedPageBreak/>
         <w:t xml:space="preserve">• </w:t>
       </w:r>
       <w:r>
@@ -12886,7 +13007,6 @@
           <w:sz w:val="32"/>
           <w:szCs w:val="32"/>
         </w:rPr>
-        <w:lastRenderedPageBreak/>
         <w:t xml:space="preserve">• </w:t>
       </w:r>
       <w:r>
@@ -13103,6 +13223,7 @@
           <w:szCs w:val="32"/>
           <w:cs/>
         </w:rPr>
+        <w:lastRenderedPageBreak/>
         <w:t xml:space="preserve">                   ตำแหน่ง ครู คศ.1</w:t>
       </w:r>
     </w:p>
@@ -13326,25 +13447,14 @@
           <w:szCs w:val="32"/>
         </w:rPr>
       </w:pPr>
-      <w:proofErr w:type="gramStart"/>
-      <w:r>
-        <w:rPr>
-          <w:rFonts w:ascii="TH SarabunPSK" w:hAnsi="TH SarabunPSK" w:cs="TH SarabunPSK"/>
-          <w:color w:val="000000" w:themeColor="text1"/>
-          <w:sz w:val="32"/>
-          <w:szCs w:val="32"/>
-        </w:rPr>
-        <w:t>( )</w:t>
-      </w:r>
-      <w:proofErr w:type="gramEnd"/>
-      <w:r>
-        <w:rPr>
-          <w:rFonts w:ascii="TH SarabunPSK" w:hAnsi="TH SarabunPSK" w:cs="TH SarabunPSK"/>
-          <w:color w:val="000000" w:themeColor="text1"/>
-          <w:sz w:val="32"/>
-          <w:szCs w:val="32"/>
-        </w:rPr>
-        <w:t xml:space="preserve"> </w:t>
+      <w:r>
+        <w:rPr>
+          <w:rFonts w:ascii="TH SarabunPSK" w:hAnsi="TH SarabunPSK" w:cs="TH SarabunPSK"/>
+          <w:color w:val="000000" w:themeColor="text1"/>
+          <w:sz w:val="32"/>
+          <w:szCs w:val="32"/>
+        </w:rPr>
+        <w:t xml:space="preserve">( ) </w:t>
       </w:r>
       <w:r>
         <w:rPr>
@@ -13369,25 +13479,14 @@
           <w:szCs w:val="32"/>
         </w:rPr>
       </w:pPr>
-      <w:proofErr w:type="gramStart"/>
-      <w:r>
-        <w:rPr>
-          <w:rFonts w:ascii="TH SarabunPSK" w:hAnsi="TH SarabunPSK" w:cs="TH SarabunPSK"/>
-          <w:color w:val="000000" w:themeColor="text1"/>
-          <w:sz w:val="32"/>
-          <w:szCs w:val="32"/>
-        </w:rPr>
-        <w:t>( )</w:t>
-      </w:r>
-      <w:proofErr w:type="gramEnd"/>
-      <w:r>
-        <w:rPr>
-          <w:rFonts w:ascii="TH SarabunPSK" w:hAnsi="TH SarabunPSK" w:cs="TH SarabunPSK"/>
-          <w:color w:val="000000" w:themeColor="text1"/>
-          <w:sz w:val="32"/>
-          <w:szCs w:val="32"/>
-        </w:rPr>
-        <w:t xml:space="preserve"> </w:t>
+      <w:r>
+        <w:rPr>
+          <w:rFonts w:ascii="TH SarabunPSK" w:hAnsi="TH SarabunPSK" w:cs="TH SarabunPSK"/>
+          <w:color w:val="000000" w:themeColor="text1"/>
+          <w:sz w:val="32"/>
+          <w:szCs w:val="32"/>
+        </w:rPr>
+        <w:t xml:space="preserve">( ) </w:t>
       </w:r>
       <w:r>
         <w:rPr>
@@ -14307,6 +14406,7 @@
   <w:style w:type="paragraph" w:default="1" w:styleId="Normal">
     <w:name w:val="Normal"/>
     <w:qFormat/>
+    <w:rsid w:val="003B0C12"/>
   </w:style>
   <w:style w:type="character" w:default="1" w:styleId="DefaultParagraphFont">
     <w:name w:val="Default Paragraph Font"/>

</xml_diff>